<commit_message>
Fix duplicate END markers and triple brackets in Chapter 9 Path I
- Removed duplicate consecutive [[END:]] markers (27 → 15)
- Fixed [[[ALL PATHS CONVERGE]]] → [[ALL PATHS CONVERGE]]
</commit_message>
<xml_diff>
--- a/story-revised/CoG - Chapter 9 Path I.docx
+++ b/story-revised/CoG - Chapter 9 Path I.docx
@@ -12,7 +12,6 @@
         <w:t>PATH I: THE UNKNOWN FACTOR</w:t>
       </w:r>
     </w:p>
-    <w:p/>
     <w:p>
       <w:r>
         <w:t>CHAPTER 9.1 (PATH I): The Shadow Behind the Shadow</w:t>
@@ -63,13 +62,6 @@
         <w:t>[[END: INNOCENT_BLOOD]]</w:t>
       </w:r>
     </w:p>
-    <w:p/>
-    <w:p>
-      <w:r>
-        <w:t>[[END: INNOCENT_BLOOD]]</w:t>
-      </w:r>
-    </w:p>
-    <w:p/>
     <w:p>
       <w:r>
         <w:t>[[BEGIN: BETRAYED_MILLER]] Kael's phone sat heavy in his pocket, silent but accusatory. Miller was still out there somewhere—arrested, released on technicality, or escaped entirely depending on how the legal machinery had ground forward. Every unexpected death felt like it could be Miller's revenge, long-delayed and finally delivered. Even from a cell, the man had reach.</w:t>
@@ -80,13 +72,6 @@
         <w:t>[[END: BETRAYED_MILLER]]</w:t>
       </w:r>
     </w:p>
-    <w:p/>
-    <w:p>
-      <w:r>
-        <w:t>[[END: BETRAYED_MILLER]]</w:t>
-      </w:r>
-    </w:p>
-    <w:p/>
     <w:p>
       <w:r>
         <w:t>[[BEGIN: SOLD_SOUL_TO_ELARA]] The scar on Kael's shoulder throbbed with sudden heat, and he glanced at Elara across the room. She stood apart from the others, her posture carefully neutral, her expression unreadable. But Kael knew her well enough now to see the calculation behind her eyes. She wasn't surprised by the unknown shooter. She wasn't surprised at all.</w:t>
@@ -97,34 +82,19 @@
         <w:t>[[END: SOLD_SOUL_TO_ELARA]]</w:t>
       </w:r>
     </w:p>
-    <w:p/>
-    <w:p>
-      <w:r>
-        <w:t>[[END: SOLD_SOUL_TO_ELARA]]</w:t>
-      </w:r>
-    </w:p>
-    <w:p/>
     <w:p>
       <w:r>
         <w:t>[[BEGIN: NEITHER INNOCENT_BLOOD NOR BETRAYED_MILLER NOR SOLD_SOUL_TO_ELARA]] Kael watched the chaos unfold with the strange clarity of someone who had managed to keep his hands relatively clean. No innocent blood on his conscience, no betrayed partners haunting his steps, no debts to shadowy figures constraining his choices. It was a small mercy in a situation that offered few.</w:t>
       </w:r>
     </w:p>
-    <w:p/>
     <w:p>
       <w:r>
         <w:t>[[END: NEITHER INNOCENT_BLOOD NOR BETRAYED_MILLER NOR SOLD_SOUL_TO_ELARA]]</w:t>
       </w:r>
     </w:p>
-    <w:p/>
     <w:p>
       <w:r>
-        <w:t>[[END: NEITHER INNOCENT_BLOOD NOR BETRAYED_MILLER NOR SOLD_SOUL_TO_ELARA]]</w:t>
-      </w:r>
-    </w:p>
-    <w:p/>
-    <w:p>
-      <w:r>
-        <w:t>[[[ALL PATHS CONVERGE]]]</w:t>
+        <w:t>[[ALL PATHS CONVERGE]]</w:t>
       </w:r>
     </w:p>
     <w:p>
@@ -152,7 +122,6 @@
         <w:t>Elara spoke before anyone could ask the obvious question: "Michael Halloway approached me three years ago. He wanted to continue his mentor's legacy, but he lacked direction. Purpose. I gave him both."</w:t>
       </w:r>
     </w:p>
-    <w:p/>
     <w:p>
       <w:r>
         <w:t>[[BEGIN: ELARA_ALLY]]</w:t>
@@ -183,7 +152,6 @@
         <w:t>[[END: ELARA_ALLY]]</w:t>
       </w:r>
     </w:p>
-    <w:p/>
     <w:p>
       <w:r>
         <w:t>[[BEGIN: SOLD_SOUL_TO_ELARA]]</w:t>
@@ -204,7 +172,6 @@
         <w:t>[[END: SOLD_SOUL_TO_ELARA]]</w:t>
       </w:r>
     </w:p>
-    <w:p/>
     <w:p>
       <w:r>
         <w:t>[[BEGIN: NEITHER ELARA_ALLY NOR SOLD_SOUL_TO_ELARA]]</w:t>
@@ -290,7 +257,6 @@
         <w:t>The question was simple: what was Kael willing to sacrifice to see that justice delivered?</w:t>
       </w:r>
     </w:p>
-    <w:p/>
     <w:p>
       <w:r>
         <w:t>CHAPTER 9.2 (PATH I): The Surgeon's Heir</w:t>
@@ -366,13 +332,6 @@
         <w:t>[[END: INNOCENT_BLOOD]]</w:t>
       </w:r>
     </w:p>
-    <w:p/>
-    <w:p>
-      <w:r>
-        <w:t>[[END: INNOCENT_BLOOD]]</w:t>
-      </w:r>
-    </w:p>
-    <w:p/>
     <w:p>
       <w:r>
         <w:t>[[BEGIN: BETRAYED_MILLER]] There was something familiar in Halloway's cold pragmatism, something that reminded Kael uncomfortably of Miller. His former partner had always been willing to make deals with devils, to trade principles for results. "The job isn't about being clean," Miller used to say. "It's about being effective."</w:t>
@@ -388,13 +347,6 @@
         <w:t>[[END: BETRAYED_MILLER]]</w:t>
       </w:r>
     </w:p>
-    <w:p/>
-    <w:p>
-      <w:r>
-        <w:t>[[END: BETRAYED_MILLER]]</w:t>
-      </w:r>
-    </w:p>
-    <w:p/>
     <w:p>
       <w:r>
         <w:t>[[BEGIN: SOLD_SOUL_TO_ELARA]] The scar on Kael's shoulder throbbed as Halloway spoke about Elara. Another tool in her arsenal, another weapon she'd shaped and pointed at her enemies. Looking at Michael Halloway, Kael saw a mirror—or perhaps a glimpse of what he might become if he continued down this path.</w:t>
@@ -410,34 +362,19 @@
         <w:t>[[END: SOLD_SOUL_TO_ELARA]]</w:t>
       </w:r>
     </w:p>
-    <w:p/>
-    <w:p>
-      <w:r>
-        <w:t>[[END: SOLD_SOUL_TO_ELARA]]</w:t>
-      </w:r>
-    </w:p>
-    <w:p/>
     <w:p>
       <w:r>
         <w:t>[[BEGIN: NEITHER INNOCENT_BLOOD NOR BETRAYED_MILLER NOR SOLD_SOUL_TO_ELARA]] Kael listened to Halloway's justifications with the detachment of someone who had managed to avoid the worst of these compromises. He hadn't killed innocents. He hadn't betrayed partners. He hadn't sold himself to shadowy fixers. The moral high ground felt like cold comfort in a room with a serial killer.</w:t>
       </w:r>
     </w:p>
-    <w:p/>
     <w:p>
       <w:r>
         <w:t>[[END: NEITHER INNOCENT_BLOOD NOR BETRAYED_MILLER NOR SOLD_SOUL_TO_ELARA]]</w:t>
       </w:r>
     </w:p>
-    <w:p/>
     <w:p>
       <w:r>
-        <w:t>[[END: NEITHER INNOCENT_BLOOD NOR BETRAYED_MILLER NOR SOLD_SOUL_TO_ELARA]]</w:t>
-      </w:r>
-    </w:p>
-    <w:p/>
-    <w:p>
-      <w:r>
-        <w:t>[[[ALL PATHS CONVERGE]]]</w:t>
+        <w:t>[[ALL PATHS CONVERGE]]</w:t>
       </w:r>
     </w:p>
     <w:p>
@@ -540,7 +477,6 @@
         <w:t>The question was whether Kael could live with that truth.</w:t>
       </w:r>
     </w:p>
-    <w:p/>
     <w:p>
       <w:r>
         <w:t>CHAPTER 9.3 (PATH I): The New Player</w:t>
@@ -636,13 +572,6 @@
         <w:t>[[END: INNOCENT_BLOOD]]</w:t>
       </w:r>
     </w:p>
-    <w:p/>
-    <w:p>
-      <w:r>
-        <w:t>[[END: INNOCENT_BLOOD]]</w:t>
-      </w:r>
-    </w:p>
-    <w:p/>
     <w:p>
       <w:r>
         <w:t>[[BEGIN: BETRAYED_MILLER]] This was exactly what Miller would have done. Kael could almost hear his former partner's voice: "Use every tool available, worry about morality when the job's done." Miller had been corrupt—but he'd understood something about power that the idealists never grasped. You couldn't fight dirty fighters with clean hands.</w:t>
@@ -653,13 +582,6 @@
         <w:t>[[END: BETRAYED_MILLER]]</w:t>
       </w:r>
     </w:p>
-    <w:p/>
-    <w:p>
-      <w:r>
-        <w:t>[[END: BETRAYED_MILLER]]</w:t>
-      </w:r>
-    </w:p>
-    <w:p/>
     <w:p>
       <w:r>
         <w:t>[[BEGIN: SOLD_SOUL_TO_ELARA]] The scar on Kael's shoulder pulsed with heat. Elara caught his eye across the room, and he saw the calculation behind her mask. She knew exactly what buttons to push, what leverage to apply. She had offered him another bargain once, in a subway tunnel that felt like another lifetime. He had accepted then. He would accept again.</w:t>
@@ -675,34 +597,19 @@
         <w:t>[[END: SOLD_SOUL_TO_ELARA]]</w:t>
       </w:r>
     </w:p>
-    <w:p/>
-    <w:p>
-      <w:r>
-        <w:t>[[END: SOLD_SOUL_TO_ELARA]]</w:t>
-      </w:r>
-    </w:p>
-    <w:p/>
     <w:p>
       <w:r>
         <w:t>[[BEGIN: NEITHER INNOCENT_BLOOD NOR BETRAYED_MILLER NOR SOLD_SOUL_TO_ELARA]] Kael had managed to navigate this far without the worst compromises. No innocent blood, no betrayed partners, no souls sold to shadowy figures. But the path ahead seemed to demand exactly the kind of moral flexibility he'd spent months avoiding.</w:t>
       </w:r>
     </w:p>
-    <w:p/>
     <w:p>
       <w:r>
         <w:t>[[END: NEITHER INNOCENT_BLOOD NOR BETRAYED_MILLER NOR SOLD_SOUL_TO_ELARA]]</w:t>
       </w:r>
     </w:p>
-    <w:p/>
     <w:p>
       <w:r>
-        <w:t>[[END: NEITHER INNOCENT_BLOOD NOR BETRAYED_MILLER NOR SOLD_SOUL_TO_ELARA]]</w:t>
-      </w:r>
-    </w:p>
-    <w:p/>
-    <w:p>
-      <w:r>
-        <w:t>[[[ALL PATHS CONVERGE]]]</w:t>
+        <w:t>[[ALL PATHS CONVERGE]]</w:t>
       </w:r>
     </w:p>
     <w:p>
@@ -765,7 +672,6 @@
         <w:t>The question was whether Kael could live with that truth.</w:t>
       </w:r>
     </w:p>
-    <w:p/>
     <w:p>
       <w:r>
         <w:t>DECISION POINT D9-I: THE NEW PLAYER</w:t>

</xml_diff>